<commit_message>
re did intro.. needed some work
</commit_message>
<xml_diff>
--- a/Docs/FeedbackIn/0930_VS_Machine learning applied to otolith timeseries data to discriminate river of origin for Western Alaska Salmon.docx
+++ b/Docs/FeedbackIn/0930_VS_Machine learning applied to otolith timeseries data to discriminate river of origin for Western Alaska Salmon.docx
@@ -3767,7 +3767,75 @@
           <w:sz w:val="22"/>
           <w:szCs w:val="22"/>
         </w:rPr>
-        <w:t xml:space="preserve">: </w:t>
+        <w:t xml:space="preserve"> using the </w:t>
+      </w:r>
+      <w:commentRangeStart w:id="2"/>
+      <w:r>
+        <w:rPr>
+          <w:rFonts w:ascii="Garamond" w:hAnsi="Garamond"/>
+          <w:sz w:val="22"/>
+          <w:szCs w:val="22"/>
+        </w:rPr>
+        <w:t>{</w:t>
+      </w:r>
+      <w:proofErr w:type="spellStart"/>
+      <w:r>
+        <w:rPr>
+          <w:rFonts w:ascii="Garamond" w:hAnsi="Garamond"/>
+          <w:sz w:val="22"/>
+          <w:szCs w:val="22"/>
+        </w:rPr>
+        <w:t>tidymodels</w:t>
+      </w:r>
+      <w:proofErr w:type="spellEnd"/>
+      <w:r>
+        <w:rPr>
+          <w:rFonts w:ascii="Garamond" w:hAnsi="Garamond"/>
+          <w:sz w:val="22"/>
+          <w:szCs w:val="22"/>
+        </w:rPr>
+        <w:t xml:space="preserve">} </w:t>
+      </w:r>
+      <w:commentRangeEnd w:id="2"/>
+      <w:r>
+        <w:rPr>
+          <w:rStyle w:val="CommentReference"/>
+        </w:rPr>
+        <w:commentReference w:id="2"/>
+      </w:r>
+      <w:r>
+        <w:rPr>
+          <w:rFonts w:ascii="Garamond" w:hAnsi="Garamond"/>
+          <w:sz w:val="22"/>
+          <w:szCs w:val="22"/>
+        </w:rPr>
+        <w:t xml:space="preserve">package in </w:t>
+      </w:r>
+      <w:proofErr w:type="gramStart"/>
+      <w:r>
+        <w:rPr>
+          <w:rFonts w:ascii="Garamond" w:hAnsi="Garamond"/>
+          <w:sz w:val="22"/>
+          <w:szCs w:val="22"/>
+        </w:rPr>
+        <w:t xml:space="preserve">R </w:t>
+      </w:r>
+      <w:r>
+        <w:rPr>
+          <w:rFonts w:ascii="Garamond" w:hAnsi="Garamond"/>
+          <w:sz w:val="22"/>
+          <w:szCs w:val="22"/>
+        </w:rPr>
+        <w:t>:</w:t>
+      </w:r>
+      <w:proofErr w:type="gramEnd"/>
+      <w:r>
+        <w:rPr>
+          <w:rFonts w:ascii="Garamond" w:hAnsi="Garamond"/>
+          <w:sz w:val="22"/>
+          <w:szCs w:val="22"/>
+        </w:rPr>
+        <w:t xml:space="preserve"> </w:t>
       </w:r>
       <w:r>
         <w:rPr>
@@ -3844,9 +3912,35 @@
           <w:sz w:val="22"/>
           <w:szCs w:val="22"/>
         </w:rPr>
-        <w:t>The Random Forest model was configured with 500 trees, and the number of predictors randomly sampled at each split (</w:t>
-      </w:r>
-      <w:commentRangeStart w:id="2"/>
+        <w:t xml:space="preserve">The Random Forest model was configured </w:t>
+      </w:r>
+      <w:proofErr w:type="spellStart"/>
+      <w:r>
+        <w:rPr>
+          <w:rFonts w:ascii="Garamond" w:hAnsi="Garamond"/>
+          <w:sz w:val="22"/>
+          <w:szCs w:val="22"/>
+        </w:rPr>
+        <w:t>u</w:t>
+      </w:r>
+      <w:r>
+        <w:rPr>
+          <w:rFonts w:ascii="Garamond" w:hAnsi="Garamond"/>
+          <w:sz w:val="22"/>
+          <w:szCs w:val="22"/>
+        </w:rPr>
+        <w:t>with</w:t>
+      </w:r>
+      <w:proofErr w:type="spellEnd"/>
+      <w:r>
+        <w:rPr>
+          <w:rFonts w:ascii="Garamond" w:hAnsi="Garamond"/>
+          <w:sz w:val="22"/>
+          <w:szCs w:val="22"/>
+        </w:rPr>
+        <w:t xml:space="preserve"> 500 trees, and the number of predictors randomly sampled at each split (</w:t>
+      </w:r>
+      <w:commentRangeStart w:id="3"/>
       <w:proofErr w:type="spellStart"/>
       <w:r>
         <w:rPr>
@@ -3866,12 +3960,12 @@
         </w:rPr>
         <w:t>)</w:t>
       </w:r>
-      <w:commentRangeEnd w:id="2"/>
+      <w:commentRangeEnd w:id="3"/>
       <w:r>
         <w:rPr>
           <w:rStyle w:val="CommentReference"/>
         </w:rPr>
-        <w:commentReference w:id="2"/>
+        <w:commentReference w:id="3"/>
       </w:r>
       <w:r>
         <w:rPr>
@@ -3909,7 +4003,7 @@
         </w:rPr>
         <w:t xml:space="preserve"> framework in </w:t>
       </w:r>
-      <w:commentRangeStart w:id="3"/>
+      <w:commentRangeStart w:id="4"/>
       <w:r>
         <w:rPr>
           <w:rFonts w:ascii="Garamond" w:hAnsi="Garamond"/>
@@ -3926,12 +4020,12 @@
         </w:rPr>
         <w:t xml:space="preserve">. </w:t>
       </w:r>
-      <w:commentRangeEnd w:id="3"/>
+      <w:commentRangeEnd w:id="4"/>
       <w:r>
         <w:rPr>
           <w:rStyle w:val="CommentReference"/>
         </w:rPr>
-        <w:commentReference w:id="3"/>
+        <w:commentReference w:id="4"/>
       </w:r>
     </w:p>
     <w:p>
@@ -4522,18 +4616,76 @@
           <w:sz w:val="22"/>
           <w:szCs w:val="22"/>
         </w:rPr>
-        <w:t xml:space="preserve">Many machine learning classification models produce probability estimates that do not accurately reflect the true likelihood of correct prediction. While these models may achieve high classification accuracy, their reported confidence </w:t>
-      </w:r>
-      <w:commentRangeStart w:id="4"/>
-      <w:r>
-        <w:rPr>
-          <w:rFonts w:ascii="Garamond" w:hAnsi="Garamond"/>
-          <w:sz w:val="22"/>
-          <w:szCs w:val="22"/>
-        </w:rPr>
-        <w:t>levels</w:t>
-      </w:r>
-      <w:commentRangeEnd w:id="4"/>
+        <w:t>Many machine learning classification models produce probability estimates that do not accurately reflect the true likelihood of correct prediction. While these models may achieve high classification accuracy, their reported confidence</w:t>
+      </w:r>
+      <w:r>
+        <w:rPr>
+          <w:rFonts w:ascii="Garamond" w:hAnsi="Garamond"/>
+          <w:sz w:val="22"/>
+          <w:szCs w:val="22"/>
+        </w:rPr>
+        <w:t xml:space="preserve"> scores</w:t>
+      </w:r>
+      <w:r>
+        <w:rPr>
+          <w:rFonts w:ascii="Garamond" w:hAnsi="Garamond"/>
+          <w:sz w:val="22"/>
+          <w:szCs w:val="22"/>
+        </w:rPr>
+        <w:t xml:space="preserve"> may not match the true proportion of correct classifications within each confidence </w:t>
+      </w:r>
+      <w:proofErr w:type="gramStart"/>
+      <w:r>
+        <w:rPr>
+          <w:rFonts w:ascii="Garamond" w:hAnsi="Garamond"/>
+          <w:sz w:val="22"/>
+          <w:szCs w:val="22"/>
+        </w:rPr>
+        <w:t>bin</w:t>
+      </w:r>
+      <w:r>
+        <w:rPr>
+          <w:rFonts w:ascii="Garamond" w:hAnsi="Garamond"/>
+          <w:sz w:val="22"/>
+          <w:szCs w:val="22"/>
+        </w:rPr>
+        <w:t xml:space="preserve"> </w:t>
+      </w:r>
+      <w:r>
+        <w:rPr>
+          <w:rFonts w:ascii="Garamond" w:hAnsi="Garamond"/>
+          <w:sz w:val="22"/>
+          <w:szCs w:val="22"/>
+        </w:rPr>
+        <w:t>.</w:t>
+      </w:r>
+      <w:proofErr w:type="gramEnd"/>
+      <w:r>
+        <w:rPr>
+          <w:rFonts w:ascii="Garamond" w:hAnsi="Garamond"/>
+          <w:sz w:val="22"/>
+          <w:szCs w:val="22"/>
+        </w:rPr>
+        <w:t xml:space="preserve"> </w:t>
+      </w:r>
+      <w:r>
+        <w:rPr>
+          <w:rFonts w:ascii="Garamond" w:hAnsi="Garamond"/>
+          <w:sz w:val="22"/>
+          <w:szCs w:val="22"/>
+        </w:rPr>
+        <w:t>Although these scores may provide sufficient class ranking, t</w:t>
+      </w:r>
+      <w:commentRangeStart w:id="5"/>
+      <w:r>
+        <w:rPr>
+          <w:rFonts w:ascii="Garamond" w:hAnsi="Garamond"/>
+          <w:sz w:val="22"/>
+          <w:szCs w:val="22"/>
+        </w:rPr>
+        <w:t>his</w:t>
+      </w:r>
+      <w:commentRangeEnd w:id="5"/>
       <w:r>
         <w:rPr>
           <w:rStyle w:val="CommentReference"/>
@@ -4541,26 +4693,109 @@
           <w:kern w:val="2"/>
           <w14:ligatures w14:val="standardContextual"/>
         </w:rPr>
-        <w:commentReference w:id="4"/>
-      </w:r>
-      <w:r>
-        <w:rPr>
-          <w:rFonts w:ascii="Garamond" w:hAnsi="Garamond"/>
-          <w:sz w:val="22"/>
-          <w:szCs w:val="22"/>
-        </w:rPr>
-        <w:t xml:space="preserve"> may not match the true proportion of correct classifications within each confidence bin. </w:t>
-      </w:r>
-      <w:commentRangeStart w:id="5"/>
-      <w:r>
-        <w:rPr>
-          <w:rFonts w:ascii="Garamond" w:hAnsi="Garamond"/>
-          <w:sz w:val="22"/>
-          <w:szCs w:val="22"/>
-        </w:rPr>
-        <w:t>This</w:t>
-      </w:r>
-      <w:commentRangeEnd w:id="5"/>
+        <w:commentReference w:id="5"/>
+      </w:r>
+      <w:r>
+        <w:rPr>
+          <w:rFonts w:ascii="Garamond" w:hAnsi="Garamond"/>
+          <w:sz w:val="22"/>
+          <w:szCs w:val="22"/>
+        </w:rPr>
+        <w:t xml:space="preserve"> limits the utility of these results for decision-making based on confidence thresholds or propagation of uncertainty through further probability-based models. To calibrate predictions from our models, we used the </w:t>
+      </w:r>
+      <w:r>
+        <w:rPr>
+          <w:rFonts w:ascii="Garamond" w:hAnsi="Garamond"/>
+          <w:sz w:val="22"/>
+          <w:szCs w:val="22"/>
+        </w:rPr>
+        <w:t>{</w:t>
+      </w:r>
+      <w:r>
+        <w:rPr>
+          <w:rStyle w:val="HTMLCode"/>
+          <w:rFonts w:ascii="Garamond" w:eastAsiaTheme="majorEastAsia" w:hAnsi="Garamond"/>
+          <w:sz w:val="22"/>
+          <w:szCs w:val="22"/>
+        </w:rPr>
+        <w:t>probably</w:t>
+      </w:r>
+      <w:r>
+        <w:rPr>
+          <w:rStyle w:val="HTMLCode"/>
+          <w:rFonts w:ascii="Garamond" w:eastAsiaTheme="majorEastAsia" w:hAnsi="Garamond"/>
+          <w:sz w:val="22"/>
+          <w:szCs w:val="22"/>
+        </w:rPr>
+        <w:t>}</w:t>
+      </w:r>
+      <w:r>
+        <w:rPr>
+          <w:rFonts w:ascii="Garamond" w:hAnsi="Garamond"/>
+          <w:sz w:val="22"/>
+          <w:szCs w:val="22"/>
+        </w:rPr>
+        <w:t xml:space="preserve"> package in R to apply multinomial isotonic regression to our testing set predictions. </w:t>
+      </w:r>
+      <w:commentRangeStart w:id="6"/>
+      <w:commentRangeStart w:id="7"/>
+      <w:r>
+        <w:rPr>
+          <w:rFonts w:ascii="Garamond" w:hAnsi="Garamond"/>
+          <w:sz w:val="22"/>
+          <w:szCs w:val="22"/>
+        </w:rPr>
+        <w:t xml:space="preserve">This approach adjusts the </w:t>
+      </w:r>
+      <w:r>
+        <w:rPr>
+          <w:rFonts w:ascii="Garamond" w:hAnsi="Garamond"/>
+          <w:sz w:val="22"/>
+          <w:szCs w:val="22"/>
+        </w:rPr>
+        <w:t xml:space="preserve">raw </w:t>
+      </w:r>
+      <w:r>
+        <w:rPr>
+          <w:rFonts w:ascii="Garamond" w:hAnsi="Garamond"/>
+          <w:sz w:val="22"/>
+          <w:szCs w:val="22"/>
+        </w:rPr>
+        <w:t xml:space="preserve">probability </w:t>
+      </w:r>
+      <w:r>
+        <w:rPr>
+          <w:rFonts w:ascii="Garamond" w:hAnsi="Garamond"/>
+          <w:sz w:val="22"/>
+          <w:szCs w:val="22"/>
+        </w:rPr>
+        <w:t>scores</w:t>
+      </w:r>
+      <w:r>
+        <w:rPr>
+          <w:rFonts w:ascii="Garamond" w:hAnsi="Garamond"/>
+          <w:sz w:val="22"/>
+          <w:szCs w:val="22"/>
+        </w:rPr>
+        <w:t xml:space="preserve"> to better align </w:t>
+      </w:r>
+      <w:r>
+        <w:rPr>
+          <w:rFonts w:ascii="Garamond" w:hAnsi="Garamond"/>
+          <w:sz w:val="22"/>
+          <w:szCs w:val="22"/>
+        </w:rPr>
+        <w:t>with the true observed probabilities</w:t>
+      </w:r>
+      <w:r>
+        <w:rPr>
+          <w:rFonts w:ascii="Garamond" w:hAnsi="Garamond"/>
+          <w:sz w:val="22"/>
+          <w:szCs w:val="22"/>
+        </w:rPr>
+        <w:t xml:space="preserve"> through a non-parametric monotonic transformation. </w:t>
+      </w:r>
+      <w:commentRangeEnd w:id="6"/>
       <w:r>
         <w:rPr>
           <w:rStyle w:val="CommentReference"/>
@@ -4568,61 +4803,9 @@
           <w:kern w:val="2"/>
           <w14:ligatures w14:val="standardContextual"/>
         </w:rPr>
-        <w:commentReference w:id="5"/>
-      </w:r>
-      <w:r>
-        <w:rPr>
-          <w:rFonts w:ascii="Garamond" w:hAnsi="Garamond"/>
-          <w:sz w:val="22"/>
-          <w:szCs w:val="22"/>
-        </w:rPr>
-        <w:t xml:space="preserve"> limits the utility of these results for decision-making based on confidence thresholds or propagation of uncertainty through further probability-based models. To calibrate predictions from our models, we used the </w:t>
-      </w:r>
-      <w:r>
-        <w:rPr>
-          <w:rFonts w:ascii="Garamond" w:hAnsi="Garamond"/>
-          <w:sz w:val="22"/>
-          <w:szCs w:val="22"/>
-        </w:rPr>
-        <w:t>{</w:t>
-      </w:r>
-      <w:r>
-        <w:rPr>
-          <w:rStyle w:val="HTMLCode"/>
-          <w:rFonts w:ascii="Garamond" w:eastAsiaTheme="majorEastAsia" w:hAnsi="Garamond"/>
-          <w:sz w:val="22"/>
-          <w:szCs w:val="22"/>
-        </w:rPr>
-        <w:t>probably</w:t>
-      </w:r>
-      <w:r>
-        <w:rPr>
-          <w:rStyle w:val="HTMLCode"/>
-          <w:rFonts w:ascii="Garamond" w:eastAsiaTheme="majorEastAsia" w:hAnsi="Garamond"/>
-          <w:sz w:val="22"/>
-          <w:szCs w:val="22"/>
-        </w:rPr>
-        <w:t>}</w:t>
-      </w:r>
-      <w:r>
-        <w:rPr>
-          <w:rFonts w:ascii="Garamond" w:hAnsi="Garamond"/>
-          <w:sz w:val="22"/>
-          <w:szCs w:val="22"/>
-        </w:rPr>
-        <w:t xml:space="preserve"> package in R to apply multinomial isotonic regression to our testing set predictions. </w:t>
-      </w:r>
-      <w:commentRangeStart w:id="6"/>
-      <w:commentRangeStart w:id="7"/>
-      <w:r>
-        <w:rPr>
-          <w:rFonts w:ascii="Garamond" w:hAnsi="Garamond"/>
-          <w:sz w:val="22"/>
-          <w:szCs w:val="22"/>
-        </w:rPr>
-        <w:t xml:space="preserve">This approach adjusts the raw probability outputs to better align predicted confidence with actual classification accuracy through a non-parametric monotonic transformation. </w:t>
-      </w:r>
-      <w:commentRangeEnd w:id="6"/>
+        <w:commentReference w:id="6"/>
+      </w:r>
+      <w:commentRangeEnd w:id="7"/>
       <w:r>
         <w:rPr>
           <w:rStyle w:val="CommentReference"/>
@@ -4630,16 +4813,6 @@
           <w:kern w:val="2"/>
           <w14:ligatures w14:val="standardContextual"/>
         </w:rPr>
-        <w:commentReference w:id="6"/>
-      </w:r>
-      <w:commentRangeEnd w:id="7"/>
-      <w:r>
-        <w:rPr>
-          <w:rStyle w:val="CommentReference"/>
-          <w:rFonts w:asciiTheme="minorHAnsi" w:eastAsiaTheme="minorHAnsi" w:hAnsiTheme="minorHAnsi" w:cstheme="minorBidi"/>
-          <w:kern w:val="2"/>
-          <w14:ligatures w14:val="standardContextual"/>
-        </w:rPr>
         <w:commentReference w:id="7"/>
       </w:r>
       <w:r>
@@ -4696,7 +4869,7 @@
           <w:sz w:val="22"/>
           <w:szCs w:val="22"/>
         </w:rPr>
-        <w:t xml:space="preserve">Calibration transformations were fitted separately for each model-data type combination and stored as reusable functions that can be applied consistently to future predictions. This ensures that probability estimates from our models accurately </w:t>
+        <w:t xml:space="preserve">Calibration transformations were fitted separately for each model-data type combination and stored as reusable functions that can be applied consistently to future predictions. This ensures that </w:t>
       </w:r>
       <w:r>
         <w:rPr>
@@ -4705,7 +4878,7 @@
           <w:szCs w:val="22"/>
         </w:rPr>
         <w:lastRenderedPageBreak/>
-        <w:t>reflect true classification confidence</w:t>
+        <w:t>probability estimates from our models accurately reflect true classification confidence</w:t>
       </w:r>
       <w:r>
         <w:rPr>
@@ -5390,31 +5563,23 @@
           <w:sz w:val="22"/>
           <w:szCs w:val="22"/>
         </w:rPr>
-        <w:t xml:space="preserve">accuracy and F1-score achieved by applying the random forest model to the GAM smoothed dataset and tested on the full testing set. Smoothed timeseries data outperformed the raw data in all cases, indicating that the noise in the raw data may </w:t>
-      </w:r>
-      <w:commentRangeStart w:id="9"/>
-      <w:r>
-        <w:rPr>
-          <w:rFonts w:ascii="Garamond" w:hAnsi="Garamond"/>
-          <w:sz w:val="22"/>
-          <w:szCs w:val="22"/>
-        </w:rPr>
-        <w:t>inhibited</w:t>
-      </w:r>
-      <w:commentRangeEnd w:id="9"/>
-      <w:r>
-        <w:rPr>
-          <w:rStyle w:val="CommentReference"/>
-        </w:rPr>
-        <w:commentReference w:id="9"/>
-      </w:r>
-      <w:r>
-        <w:rPr>
-          <w:rFonts w:ascii="Garamond" w:hAnsi="Garamond"/>
-          <w:sz w:val="22"/>
-          <w:szCs w:val="22"/>
-        </w:rPr>
-        <w:t xml:space="preserve"> model </w:t>
+        <w:t>accuracy and F1-score achieved by applying the random forest model to the GAM smoothed dataset and tested on the full testing set. Smoothed timeseries data outperformed the raw data in all cases, indicating that the noise in the raw data ma</w:t>
+      </w:r>
+      <w:r>
+        <w:rPr>
+          <w:rFonts w:ascii="Garamond" w:hAnsi="Garamond"/>
+          <w:sz w:val="22"/>
+          <w:szCs w:val="22"/>
+        </w:rPr>
+        <w:t>y have</w:t>
+      </w:r>
+      <w:r>
+        <w:rPr>
+          <w:rFonts w:ascii="Garamond" w:hAnsi="Garamond"/>
+          <w:sz w:val="22"/>
+          <w:szCs w:val="22"/>
+        </w:rPr>
+        <w:t xml:space="preserve"> inhibited model </w:t>
       </w:r>
       <w:r>
         <w:rPr>
@@ -5633,7 +5798,16 @@
           <w:sz w:val="22"/>
           <w:szCs w:val="22"/>
         </w:rPr>
-        <w:t xml:space="preserve"> fish did not change (91.4%) whereas Kuskokwim saw a slight increase to 92.5%. In this testing set the most frequent misclassification was Yukon fish predicted to have been Kuskokwim (8.8% of Yukon fish</w:t>
+        <w:t xml:space="preserve"> fish did not change (91.4%) whereas Kuskokwim saw a slight increase to 92.5%. In this testing set the most frequent </w:t>
+      </w:r>
+      <w:r>
+        <w:rPr>
+          <w:rFonts w:ascii="Garamond" w:hAnsi="Garamond"/>
+          <w:sz w:val="22"/>
+          <w:szCs w:val="22"/>
+        </w:rPr>
+        <w:lastRenderedPageBreak/>
+        <w:t>misclassification was Yukon fish predicted to have been Kuskokwim (8.8% of Yukon fish</w:t>
       </w:r>
       <w:proofErr w:type="gramStart"/>
       <w:r>
@@ -5651,16 +5825,7 @@
           <w:sz w:val="22"/>
           <w:szCs w:val="22"/>
         </w:rPr>
-        <w:t xml:space="preserve"> however this </w:t>
-      </w:r>
-      <w:r>
-        <w:rPr>
-          <w:rFonts w:ascii="Garamond" w:hAnsi="Garamond"/>
-          <w:sz w:val="22"/>
-          <w:szCs w:val="22"/>
-        </w:rPr>
-        <w:lastRenderedPageBreak/>
-        <w:t xml:space="preserve">represented only one additional individual misclassified (9 in the total analysis vs 8 in the overlapping analysis). </w:t>
+        <w:t xml:space="preserve"> however this represented only one additional individual misclassified (9 in the total analysis vs 8 in the overlapping analysis). </w:t>
       </w:r>
       <w:r>
         <w:rPr>
@@ -5774,7 +5939,7 @@
           <w:szCs w:val="22"/>
         </w:rPr>
       </w:pPr>
-      <w:commentRangeStart w:id="10"/>
+      <w:commentRangeStart w:id="9"/>
       <w:r>
         <w:rPr>
           <w:rFonts w:ascii="Garamond" w:hAnsi="Garamond"/>
@@ -5783,12 +5948,20 @@
         </w:rPr>
         <w:t>Across the range of tested thresholds, overall accuracy ranged from 91 – 79% for the total testing set and from 89.5% to 78% for the overlapping dataset</w:t>
       </w:r>
-      <w:commentRangeEnd w:id="10"/>
+      <w:commentRangeEnd w:id="9"/>
       <w:r>
         <w:rPr>
           <w:rStyle w:val="CommentReference"/>
         </w:rPr>
-        <w:commentReference w:id="10"/>
+        <w:commentReference w:id="9"/>
+      </w:r>
+      <w:r>
+        <w:rPr>
+          <w:rFonts w:ascii="Garamond" w:hAnsi="Garamond"/>
+          <w:sz w:val="22"/>
+          <w:szCs w:val="22"/>
+        </w:rPr>
+        <w:t xml:space="preserve"> before calibration</w:t>
       </w:r>
       <w:r>
         <w:rPr>
@@ -5958,7 +6131,7 @@
         </w:rPr>
         <w:t xml:space="preserve">Datasets preprocessed with timeseries smoothing techniques significantly outperformed raw laser ablation data. </w:t>
       </w:r>
-      <w:commentRangeStart w:id="11"/>
+      <w:commentRangeStart w:id="10"/>
       <w:r>
         <w:rPr>
           <w:rFonts w:ascii="Garamond" w:hAnsi="Garamond"/>
@@ -6037,7 +6210,7 @@
           <w:sz w:val="22"/>
           <w:szCs w:val="22"/>
         </w:rPr>
-        <w:t xml:space="preserve"> techniques to sequentially ordered otolith LA </w:t>
+        <w:t xml:space="preserve"> techniques to otolith LA </w:t>
       </w:r>
       <w:r>
         <w:rPr>
@@ -6053,14 +6226,48 @@
           <w:sz w:val="22"/>
           <w:szCs w:val="22"/>
         </w:rPr>
-        <w:t xml:space="preserve"> and suggests that even greater discriminatory power may be possible through the addition of more complex timeseries analysis techniques. </w:t>
-      </w:r>
-      <w:commentRangeEnd w:id="11"/>
+        <w:t xml:space="preserve"> and suggests that even greater discriminatory power may be possible </w:t>
+      </w:r>
+      <w:proofErr w:type="gramStart"/>
+      <w:r>
+        <w:rPr>
+          <w:rFonts w:ascii="Garamond" w:hAnsi="Garamond"/>
+          <w:sz w:val="22"/>
+          <w:szCs w:val="22"/>
+        </w:rPr>
+        <w:t xml:space="preserve">through the </w:t>
+      </w:r>
+      <w:r>
+        <w:rPr>
+          <w:rFonts w:ascii="Garamond" w:hAnsi="Garamond"/>
+          <w:sz w:val="22"/>
+          <w:szCs w:val="22"/>
+        </w:rPr>
+        <w:t>use of</w:t>
+      </w:r>
+      <w:proofErr w:type="gramEnd"/>
+      <w:r>
+        <w:rPr>
+          <w:rFonts w:ascii="Garamond" w:hAnsi="Garamond"/>
+          <w:sz w:val="22"/>
+          <w:szCs w:val="22"/>
+        </w:rPr>
+        <w:t xml:space="preserve"> additional </w:t>
+      </w:r>
+      <w:r>
+        <w:rPr>
+          <w:rFonts w:ascii="Garamond" w:hAnsi="Garamond"/>
+          <w:sz w:val="22"/>
+          <w:szCs w:val="22"/>
+        </w:rPr>
+        <w:t xml:space="preserve">timeseries analysis techniques. </w:t>
+      </w:r>
+      <w:commentRangeEnd w:id="10"/>
       <w:r>
         <w:rPr>
           <w:rStyle w:val="CommentReference"/>
         </w:rPr>
-        <w:commentReference w:id="11"/>
+        <w:commentReference w:id="10"/>
       </w:r>
     </w:p>
     <w:p>
@@ -6185,292 +6392,356 @@
           <w:sz w:val="22"/>
           <w:szCs w:val="22"/>
         </w:rPr>
-        <w:t>values and closer spatial proximity between these watersheds. In contrast, Yukon fish exhibited distinct otolith patterns due to the watershed's extreme spatial scale, broader range of isotope values, and extended migration timing</w:t>
-      </w:r>
-      <w:r>
-        <w:rPr>
-          <w:rFonts w:ascii="Garamond" w:hAnsi="Garamond"/>
-          <w:sz w:val="22"/>
-          <w:szCs w:val="22"/>
-        </w:rPr>
-        <w:t xml:space="preserve">. This likely resulted in otolith timeseries which were distinct compared </w:t>
-      </w:r>
-      <w:commentRangeStart w:id="12"/>
-      <w:r>
-        <w:rPr>
-          <w:rFonts w:ascii="Garamond" w:hAnsi="Garamond"/>
-          <w:sz w:val="22"/>
-          <w:szCs w:val="22"/>
-        </w:rPr>
-        <w:t>distinct compared</w:t>
-      </w:r>
-      <w:commentRangeEnd w:id="12"/>
+        <w:t xml:space="preserve">values and closer spatial proximity between these watersheds. In contrast, Yukon fish exhibited </w:t>
+      </w:r>
+      <w:r>
+        <w:rPr>
+          <w:rFonts w:ascii="Garamond" w:hAnsi="Garamond"/>
+          <w:sz w:val="22"/>
+          <w:szCs w:val="22"/>
+        </w:rPr>
+        <w:t xml:space="preserve">unique </w:t>
+      </w:r>
+      <w:r>
+        <w:rPr>
+          <w:rFonts w:ascii="Garamond" w:hAnsi="Garamond"/>
+          <w:sz w:val="22"/>
+          <w:szCs w:val="22"/>
+        </w:rPr>
+        <w:t>patterns</w:t>
+      </w:r>
+      <w:r>
+        <w:rPr>
+          <w:rFonts w:ascii="Garamond" w:hAnsi="Garamond"/>
+          <w:sz w:val="22"/>
+          <w:szCs w:val="22"/>
+        </w:rPr>
+        <w:t xml:space="preserve"> in otolith LA data</w:t>
+      </w:r>
+      <w:r>
+        <w:rPr>
+          <w:rFonts w:ascii="Garamond" w:hAnsi="Garamond"/>
+          <w:sz w:val="22"/>
+          <w:szCs w:val="22"/>
+        </w:rPr>
+        <w:t xml:space="preserve"> due to the watershed's extreme spatial scale, broader range of isotope values, and extended migration timing</w:t>
+      </w:r>
+      <w:r>
+        <w:rPr>
+          <w:rFonts w:ascii="Garamond" w:hAnsi="Garamond"/>
+          <w:sz w:val="22"/>
+          <w:szCs w:val="22"/>
+        </w:rPr>
+        <w:t>. This likely resulted in otolith timeseries which were distinct compared to the other watersheds either because of natal origin values</w:t>
+      </w:r>
+      <w:r>
+        <w:rPr>
+          <w:rFonts w:ascii="Garamond" w:hAnsi="Garamond"/>
+          <w:sz w:val="22"/>
+          <w:szCs w:val="22"/>
+        </w:rPr>
+        <w:t xml:space="preserve"> only found in the Yukon (</w:t>
+      </w:r>
+      <w:r>
+        <w:rPr>
+          <w:rFonts w:ascii="Cambria Math" w:hAnsi="Cambria Math" w:cs="Cambria Math"/>
+          <w:sz w:val="22"/>
+          <w:szCs w:val="22"/>
+        </w:rPr>
+        <w:t>⁸⁷</w:t>
+      </w:r>
+      <w:r>
+        <w:rPr>
+          <w:rFonts w:ascii="Garamond" w:hAnsi="Garamond"/>
+          <w:sz w:val="22"/>
+          <w:szCs w:val="22"/>
+        </w:rPr>
+        <w:t>Sr/</w:t>
+      </w:r>
+      <w:r>
+        <w:rPr>
+          <w:rFonts w:ascii="Cambria Math" w:hAnsi="Cambria Math" w:cs="Cambria Math"/>
+          <w:sz w:val="22"/>
+          <w:szCs w:val="22"/>
+        </w:rPr>
+        <w:t>⁸⁶</w:t>
+      </w:r>
+      <w:r>
+        <w:rPr>
+          <w:rFonts w:ascii="Garamond" w:hAnsi="Garamond"/>
+          <w:sz w:val="22"/>
+          <w:szCs w:val="22"/>
+        </w:rPr>
+        <w:t>Sr</w:t>
+      </w:r>
+      <w:r>
+        <w:rPr>
+          <w:rFonts w:ascii="Garamond" w:hAnsi="Garamond"/>
+          <w:sz w:val="22"/>
+          <w:szCs w:val="22"/>
+        </w:rPr>
+        <w:t xml:space="preserve"> &gt; 0.715)</w:t>
+      </w:r>
+      <w:r>
+        <w:rPr>
+          <w:rFonts w:ascii="Garamond" w:hAnsi="Garamond"/>
+          <w:sz w:val="22"/>
+          <w:szCs w:val="22"/>
+        </w:rPr>
+        <w:t xml:space="preserve"> or prominent features </w:t>
+      </w:r>
+      <w:r>
+        <w:rPr>
+          <w:rFonts w:ascii="Garamond" w:hAnsi="Garamond"/>
+          <w:sz w:val="22"/>
+          <w:szCs w:val="22"/>
+        </w:rPr>
+        <w:t xml:space="preserve">resulting from a longer </w:t>
+      </w:r>
+      <w:r>
+        <w:rPr>
+          <w:rFonts w:ascii="Garamond" w:hAnsi="Garamond"/>
+          <w:sz w:val="22"/>
+          <w:szCs w:val="22"/>
+        </w:rPr>
+        <w:t>migration through the enriched mainstem tributary (</w:t>
+      </w:r>
+      <w:proofErr w:type="spellStart"/>
+      <w:r>
+        <w:rPr>
+          <w:rFonts w:ascii="Garamond" w:hAnsi="Garamond"/>
+          <w:sz w:val="22"/>
+          <w:szCs w:val="22"/>
+        </w:rPr>
+        <w:t>i.e</w:t>
+      </w:r>
+      <w:proofErr w:type="spellEnd"/>
+      <w:r>
+        <w:rPr>
+          <w:rFonts w:ascii="Garamond" w:hAnsi="Garamond"/>
+          <w:sz w:val="22"/>
+          <w:szCs w:val="22"/>
+        </w:rPr>
+        <w:t xml:space="preserve"> Figure 5b, column 3). </w:t>
+      </w:r>
+      <w:r>
+        <w:rPr>
+          <w:rFonts w:ascii="Garamond" w:hAnsi="Garamond"/>
+          <w:sz w:val="22"/>
+          <w:szCs w:val="22"/>
+        </w:rPr>
+        <w:t xml:space="preserve">Yukon classification accuracy dropped substantially in the "overlap" testing set (86.86% vs. 93.7% in the total testing set), despite similar numbers of misidentified individuals. </w:t>
+      </w:r>
+      <w:r>
+        <w:rPr>
+          <w:rFonts w:ascii="Garamond" w:hAnsi="Garamond"/>
+          <w:sz w:val="22"/>
+          <w:szCs w:val="22"/>
+        </w:rPr>
+        <w:t xml:space="preserve">This </w:t>
+      </w:r>
+      <w:r>
+        <w:rPr>
+          <w:rFonts w:ascii="Garamond" w:hAnsi="Garamond"/>
+          <w:sz w:val="22"/>
+          <w:szCs w:val="22"/>
+        </w:rPr>
+        <w:t>decline likely reflects the removal of the most easily classified cases</w:t>
+      </w:r>
+      <w:r>
+        <w:rPr>
+          <w:rFonts w:ascii="Garamond" w:hAnsi="Garamond"/>
+          <w:sz w:val="22"/>
+          <w:szCs w:val="22"/>
+        </w:rPr>
+        <w:t>, which is further supported by</w:t>
+      </w:r>
+      <w:r>
+        <w:rPr>
+          <w:rFonts w:ascii="Garamond" w:hAnsi="Garamond"/>
+          <w:sz w:val="22"/>
+          <w:szCs w:val="22"/>
+        </w:rPr>
+        <w:t xml:space="preserve"> </w:t>
+      </w:r>
+      <w:r>
+        <w:rPr>
+          <w:rFonts w:ascii="Garamond" w:hAnsi="Garamond"/>
+          <w:sz w:val="22"/>
+          <w:szCs w:val="22"/>
+        </w:rPr>
+        <w:t xml:space="preserve">higher misclassification rates among CWAK individuals compared to </w:t>
+      </w:r>
+      <w:r>
+        <w:rPr>
+          <w:rFonts w:ascii="Garamond" w:hAnsi="Garamond"/>
+          <w:sz w:val="22"/>
+          <w:szCs w:val="22"/>
+        </w:rPr>
+        <w:lastRenderedPageBreak/>
+        <w:t>those from the middle and upper Yukon regions</w:t>
+      </w:r>
+      <w:r>
+        <w:rPr>
+          <w:rFonts w:ascii="Garamond" w:hAnsi="Garamond"/>
+          <w:sz w:val="22"/>
+          <w:szCs w:val="22"/>
+        </w:rPr>
+        <w:t xml:space="preserve">. </w:t>
+      </w:r>
+      <w:r>
+        <w:rPr>
+          <w:rFonts w:ascii="Garamond" w:hAnsi="Garamond"/>
+          <w:sz w:val="22"/>
+          <w:szCs w:val="22"/>
+        </w:rPr>
+        <w:t>The</w:t>
+      </w:r>
+      <w:r>
+        <w:rPr>
+          <w:rFonts w:ascii="Garamond" w:hAnsi="Garamond"/>
+          <w:sz w:val="22"/>
+          <w:szCs w:val="22"/>
+        </w:rPr>
+        <w:t xml:space="preserve">se </w:t>
+      </w:r>
+      <w:r>
+        <w:rPr>
+          <w:rFonts w:ascii="Garamond" w:hAnsi="Garamond"/>
+          <w:sz w:val="22"/>
+          <w:szCs w:val="22"/>
+        </w:rPr>
+        <w:t xml:space="preserve">challenges </w:t>
+      </w:r>
+      <w:r>
+        <w:rPr>
+          <w:rFonts w:ascii="Garamond" w:hAnsi="Garamond"/>
+          <w:sz w:val="22"/>
+          <w:szCs w:val="22"/>
+        </w:rPr>
+        <w:t xml:space="preserve">likely stem </w:t>
+      </w:r>
+      <w:r>
+        <w:rPr>
+          <w:rFonts w:ascii="Garamond" w:hAnsi="Garamond"/>
+          <w:sz w:val="22"/>
+          <w:szCs w:val="22"/>
+        </w:rPr>
+        <w:t>from shorter migration patterns that include less residence time in the mainstem Yukon River</w:t>
+      </w:r>
+      <w:r>
+        <w:rPr>
+          <w:rFonts w:ascii="Garamond" w:hAnsi="Garamond"/>
+          <w:sz w:val="22"/>
+          <w:szCs w:val="22"/>
+        </w:rPr>
+        <w:t>, and, subsequently, a</w:t>
+      </w:r>
+      <w:r>
+        <w:rPr>
+          <w:rFonts w:ascii="Garamond" w:hAnsi="Garamond"/>
+          <w:sz w:val="22"/>
+          <w:szCs w:val="22"/>
+        </w:rPr>
+        <w:t xml:space="preserve"> less pronounced increase in isotope values before marine entry</w:t>
+      </w:r>
+      <w:r>
+        <w:rPr>
+          <w:rFonts w:ascii="Garamond" w:hAnsi="Garamond"/>
+          <w:sz w:val="22"/>
+          <w:szCs w:val="22"/>
+        </w:rPr>
+        <w:t xml:space="preserve">. Without this distinguishing feature, CWAK individuals from the Yukon (i.e. Figure 5b, column 4) are more likely to be misclassified with Kuskokwim or </w:t>
+      </w:r>
+      <w:proofErr w:type="spellStart"/>
+      <w:r>
+        <w:rPr>
+          <w:rFonts w:ascii="Garamond" w:hAnsi="Garamond"/>
+          <w:sz w:val="22"/>
+          <w:szCs w:val="22"/>
+        </w:rPr>
+        <w:t>Nushagak</w:t>
+      </w:r>
+      <w:proofErr w:type="spellEnd"/>
+      <w:r>
+        <w:rPr>
+          <w:rFonts w:ascii="Garamond" w:hAnsi="Garamond"/>
+          <w:sz w:val="22"/>
+          <w:szCs w:val="22"/>
+        </w:rPr>
+        <w:t xml:space="preserve"> fish, resulting in lower overall accuracy. </w:t>
+      </w:r>
+      <w:r>
+        <w:rPr>
+          <w:rFonts w:ascii="Garamond" w:hAnsi="Garamond"/>
+          <w:sz w:val="22"/>
+          <w:szCs w:val="22"/>
+        </w:rPr>
+        <w:t xml:space="preserve">Still, </w:t>
+      </w:r>
+      <w:r>
+        <w:rPr>
+          <w:rFonts w:ascii="Garamond" w:hAnsi="Garamond"/>
+          <w:sz w:val="22"/>
+          <w:szCs w:val="22"/>
+        </w:rPr>
+        <w:t>PCA analysis suggests that other features in the timeseries may also</w:t>
+      </w:r>
+      <w:r>
+        <w:rPr>
+          <w:rFonts w:ascii="Garamond" w:hAnsi="Garamond"/>
+          <w:sz w:val="22"/>
+          <w:szCs w:val="22"/>
+        </w:rPr>
+        <w:t xml:space="preserve"> contribute to </w:t>
+      </w:r>
+      <w:r>
+        <w:rPr>
+          <w:rFonts w:ascii="Garamond" w:hAnsi="Garamond"/>
+          <w:sz w:val="22"/>
+          <w:szCs w:val="22"/>
+        </w:rPr>
+        <w:t xml:space="preserve">the ability to distinguish among watersheds (Figure 5). These small </w:t>
+      </w:r>
+      <w:r>
+        <w:rPr>
+          <w:rFonts w:ascii="Garamond" w:hAnsi="Garamond"/>
+          <w:sz w:val="22"/>
+          <w:szCs w:val="22"/>
+        </w:rPr>
+        <w:t xml:space="preserve">variations may become more readily apparent for classification </w:t>
+      </w:r>
+      <w:r>
+        <w:rPr>
+          <w:rFonts w:ascii="Garamond" w:hAnsi="Garamond"/>
+          <w:sz w:val="22"/>
+          <w:szCs w:val="22"/>
+        </w:rPr>
+        <w:t>when used alongside other</w:t>
+      </w:r>
+      <w:commentRangeStart w:id="11"/>
+      <w:r>
+        <w:rPr>
+          <w:rFonts w:ascii="Garamond" w:hAnsi="Garamond"/>
+          <w:sz w:val="22"/>
+          <w:szCs w:val="22"/>
+        </w:rPr>
+        <w:t xml:space="preserve"> </w:t>
+      </w:r>
+      <w:r>
+        <w:rPr>
+          <w:rFonts w:ascii="Garamond" w:hAnsi="Garamond"/>
+          <w:sz w:val="22"/>
+          <w:szCs w:val="22"/>
+        </w:rPr>
+        <w:t>timeseries analysis techniques</w:t>
+      </w:r>
+      <w:commentRangeEnd w:id="11"/>
       <w:r>
         <w:rPr>
           <w:rStyle w:val="CommentReference"/>
         </w:rPr>
-        <w:commentReference w:id="12"/>
-      </w:r>
-      <w:r>
-        <w:rPr>
-          <w:rFonts w:ascii="Garamond" w:hAnsi="Garamond"/>
-          <w:sz w:val="22"/>
-          <w:szCs w:val="22"/>
-        </w:rPr>
-        <w:t xml:space="preserve"> to the other watersheds either because of distinct natal origin values or prominent features indicating migration through the enriched mainstem tributary (</w:t>
-      </w:r>
-      <w:proofErr w:type="spellStart"/>
-      <w:r>
-        <w:rPr>
-          <w:rFonts w:ascii="Garamond" w:hAnsi="Garamond"/>
-          <w:sz w:val="22"/>
-          <w:szCs w:val="22"/>
-        </w:rPr>
-        <w:t>i.e</w:t>
-      </w:r>
-      <w:proofErr w:type="spellEnd"/>
-      <w:r>
-        <w:rPr>
-          <w:rFonts w:ascii="Garamond" w:hAnsi="Garamond"/>
-          <w:sz w:val="22"/>
-          <w:szCs w:val="22"/>
-        </w:rPr>
-        <w:t xml:space="preserve"> Figure 5b, column 3). </w:t>
-      </w:r>
-      <w:r>
-        <w:rPr>
-          <w:rFonts w:ascii="Garamond" w:hAnsi="Garamond"/>
-          <w:sz w:val="22"/>
-          <w:szCs w:val="22"/>
-        </w:rPr>
-        <w:t xml:space="preserve">Yukon classification accuracy dropped substantially in the "overlap" testing set (86.86% vs. 93.7% in the total testing set), despite similar numbers of misidentified individuals. </w:t>
-      </w:r>
-      <w:r>
-        <w:rPr>
-          <w:rFonts w:ascii="Garamond" w:hAnsi="Garamond"/>
-          <w:sz w:val="22"/>
-          <w:szCs w:val="22"/>
-        </w:rPr>
-        <w:t xml:space="preserve">This </w:t>
-      </w:r>
-      <w:r>
-        <w:rPr>
-          <w:rFonts w:ascii="Garamond" w:hAnsi="Garamond"/>
-          <w:sz w:val="22"/>
-          <w:szCs w:val="22"/>
-        </w:rPr>
-        <w:t>decline likely reflects the removal of the most easily classified cases</w:t>
-      </w:r>
-      <w:r>
-        <w:rPr>
-          <w:rFonts w:ascii="Garamond" w:hAnsi="Garamond"/>
-          <w:sz w:val="22"/>
-          <w:szCs w:val="22"/>
-        </w:rPr>
-        <w:t>, which is further supported by</w:t>
-      </w:r>
-      <w:commentRangeStart w:id="13"/>
-      <w:r>
-        <w:rPr>
-          <w:rFonts w:ascii="Garamond" w:hAnsi="Garamond"/>
-          <w:sz w:val="22"/>
-          <w:szCs w:val="22"/>
-        </w:rPr>
-        <w:t xml:space="preserve"> </w:t>
-      </w:r>
-      <w:r>
-        <w:rPr>
-          <w:rFonts w:ascii="Garamond" w:hAnsi="Garamond"/>
-          <w:sz w:val="22"/>
-          <w:szCs w:val="22"/>
-        </w:rPr>
-        <w:t>supported by</w:t>
-      </w:r>
-      <w:commentRangeEnd w:id="13"/>
-      <w:r>
-        <w:rPr>
-          <w:rStyle w:val="CommentReference"/>
-        </w:rPr>
-        <w:commentReference w:id="13"/>
-      </w:r>
-      <w:r>
-        <w:rPr>
-          <w:rFonts w:ascii="Garamond" w:hAnsi="Garamond"/>
-          <w:sz w:val="22"/>
-          <w:szCs w:val="22"/>
-        </w:rPr>
-        <w:t xml:space="preserve"> higher misclassification rates among CWAK individuals compared to those from </w:t>
-      </w:r>
-      <w:r>
-        <w:rPr>
-          <w:rFonts w:ascii="Garamond" w:hAnsi="Garamond"/>
-          <w:sz w:val="22"/>
-          <w:szCs w:val="22"/>
-        </w:rPr>
-        <w:lastRenderedPageBreak/>
-        <w:t>the middle and upper Yukon regions</w:t>
-      </w:r>
-      <w:r>
-        <w:rPr>
-          <w:rFonts w:ascii="Garamond" w:hAnsi="Garamond"/>
-          <w:sz w:val="22"/>
-          <w:szCs w:val="22"/>
-        </w:rPr>
-        <w:t xml:space="preserve">. </w:t>
-      </w:r>
-      <w:r>
-        <w:rPr>
-          <w:rFonts w:ascii="Garamond" w:hAnsi="Garamond"/>
-          <w:sz w:val="22"/>
-          <w:szCs w:val="22"/>
-        </w:rPr>
-        <w:t>The</w:t>
-      </w:r>
-      <w:r>
-        <w:rPr>
-          <w:rFonts w:ascii="Garamond" w:hAnsi="Garamond"/>
-          <w:sz w:val="22"/>
-          <w:szCs w:val="22"/>
-        </w:rPr>
-        <w:t xml:space="preserve">se </w:t>
-      </w:r>
-      <w:r>
-        <w:rPr>
-          <w:rFonts w:ascii="Garamond" w:hAnsi="Garamond"/>
-          <w:sz w:val="22"/>
-          <w:szCs w:val="22"/>
-        </w:rPr>
-        <w:t xml:space="preserve">challenges </w:t>
-      </w:r>
-      <w:r>
-        <w:rPr>
-          <w:rFonts w:ascii="Garamond" w:hAnsi="Garamond"/>
-          <w:sz w:val="22"/>
-          <w:szCs w:val="22"/>
-        </w:rPr>
-        <w:t xml:space="preserve">likely stem </w:t>
-      </w:r>
-      <w:r>
-        <w:rPr>
-          <w:rFonts w:ascii="Garamond" w:hAnsi="Garamond"/>
-          <w:sz w:val="22"/>
-          <w:szCs w:val="22"/>
-        </w:rPr>
-        <w:t>from shorter migration patterns that include less residence time in the mainstem Yukon River</w:t>
-      </w:r>
-      <w:r>
-        <w:rPr>
-          <w:rFonts w:ascii="Garamond" w:hAnsi="Garamond"/>
-          <w:sz w:val="22"/>
-          <w:szCs w:val="22"/>
-        </w:rPr>
-        <w:t>, and, subsequently, a</w:t>
-      </w:r>
-      <w:r>
-        <w:rPr>
-          <w:rFonts w:ascii="Garamond" w:hAnsi="Garamond"/>
-          <w:sz w:val="22"/>
-          <w:szCs w:val="22"/>
-        </w:rPr>
-        <w:t xml:space="preserve"> less pronounced increase in isotope values before marine entry</w:t>
-      </w:r>
-      <w:r>
-        <w:rPr>
-          <w:rFonts w:ascii="Garamond" w:hAnsi="Garamond"/>
-          <w:sz w:val="22"/>
-          <w:szCs w:val="22"/>
-        </w:rPr>
-        <w:t xml:space="preserve">. Without this distinguishing feature, CWAK individuals from the Yukon (i.e. Figure 5b, column 4) are more likely to be misclassified with Kuskokwim or </w:t>
-      </w:r>
-      <w:proofErr w:type="spellStart"/>
-      <w:r>
-        <w:rPr>
-          <w:rFonts w:ascii="Garamond" w:hAnsi="Garamond"/>
-          <w:sz w:val="22"/>
-          <w:szCs w:val="22"/>
-        </w:rPr>
-        <w:t>Nushagak</w:t>
-      </w:r>
-      <w:proofErr w:type="spellEnd"/>
-      <w:r>
-        <w:rPr>
-          <w:rFonts w:ascii="Garamond" w:hAnsi="Garamond"/>
-          <w:sz w:val="22"/>
-          <w:szCs w:val="22"/>
-        </w:rPr>
-        <w:t xml:space="preserve"> fish, resulting in lower overall accuracy. </w:t>
-      </w:r>
-      <w:r>
-        <w:rPr>
-          <w:rFonts w:ascii="Garamond" w:hAnsi="Garamond"/>
-          <w:sz w:val="22"/>
-          <w:szCs w:val="22"/>
-        </w:rPr>
-        <w:t xml:space="preserve">Still, </w:t>
-      </w:r>
-      <w:r>
-        <w:rPr>
-          <w:rFonts w:ascii="Garamond" w:hAnsi="Garamond"/>
-          <w:sz w:val="22"/>
-          <w:szCs w:val="22"/>
-        </w:rPr>
-        <w:t>PCA analysis suggests that other features in the timeseries may also</w:t>
-      </w:r>
-      <w:r>
-        <w:rPr>
-          <w:rFonts w:ascii="Garamond" w:hAnsi="Garamond"/>
-          <w:sz w:val="22"/>
-          <w:szCs w:val="22"/>
-        </w:rPr>
-        <w:t xml:space="preserve"> contribute to </w:t>
-      </w:r>
-      <w:r>
-        <w:rPr>
-          <w:rFonts w:ascii="Garamond" w:hAnsi="Garamond"/>
-          <w:sz w:val="22"/>
-          <w:szCs w:val="22"/>
-        </w:rPr>
-        <w:t xml:space="preserve">the ability to distinguish among watersheds (Figure 5). These small </w:t>
-      </w:r>
-      <w:r>
-        <w:rPr>
-          <w:rFonts w:ascii="Garamond" w:hAnsi="Garamond"/>
-          <w:sz w:val="22"/>
-          <w:szCs w:val="22"/>
-        </w:rPr>
-        <w:t xml:space="preserve">variations may become more readily apparent for classification </w:t>
-      </w:r>
-      <w:r>
-        <w:rPr>
-          <w:rFonts w:ascii="Garamond" w:hAnsi="Garamond"/>
-          <w:sz w:val="22"/>
-          <w:szCs w:val="22"/>
-        </w:rPr>
-        <w:t>when used alongside other</w:t>
-      </w:r>
-      <w:commentRangeStart w:id="14"/>
-      <w:r>
-        <w:rPr>
-          <w:rFonts w:ascii="Garamond" w:hAnsi="Garamond"/>
-          <w:sz w:val="22"/>
-          <w:szCs w:val="22"/>
-        </w:rPr>
-        <w:t xml:space="preserve"> </w:t>
-      </w:r>
-      <w:r>
-        <w:rPr>
-          <w:rFonts w:ascii="Garamond" w:hAnsi="Garamond"/>
-          <w:sz w:val="22"/>
-          <w:szCs w:val="22"/>
-        </w:rPr>
-        <w:t>timeseries analysis techniques</w:t>
-      </w:r>
-      <w:commentRangeEnd w:id="14"/>
-      <w:r>
-        <w:rPr>
-          <w:rStyle w:val="CommentReference"/>
-        </w:rPr>
-        <w:commentReference w:id="14"/>
+        <w:commentReference w:id="11"/>
       </w:r>
       <w:r>
         <w:rPr>
@@ -6526,8 +6797,6 @@
         <w:ind w:firstLine="720"/>
         <w:rPr>
           <w:rFonts w:ascii="Garamond" w:hAnsi="Garamond"/>
-          <w:sz w:val="22"/>
-          <w:szCs w:val="22"/>
         </w:rPr>
       </w:pPr>
       <w:r>
@@ -6548,14 +6817,163 @@
         </w:rPr>
         <w:t xml:space="preserve">The </w:t>
       </w:r>
-      <w:commentRangeStart w:id="15"/>
-      <w:r>
-        <w:rPr>
-          <w:rFonts w:ascii="Garamond" w:hAnsi="Garamond"/>
-        </w:rPr>
-        <w:t>models</w:t>
-      </w:r>
-      <w:commentRangeEnd w:id="15"/>
+      <w:r>
+        <w:rPr>
+          <w:rFonts w:ascii="Garamond" w:hAnsi="Garamond"/>
+        </w:rPr>
+        <w:t xml:space="preserve">workflow </w:t>
+      </w:r>
+      <w:r>
+        <w:rPr>
+          <w:rFonts w:ascii="Garamond" w:hAnsi="Garamond"/>
+        </w:rPr>
+        <w:t xml:space="preserve">presented </w:t>
+      </w:r>
+      <w:r>
+        <w:rPr>
+          <w:rFonts w:ascii="Garamond" w:hAnsi="Garamond"/>
+        </w:rPr>
+        <w:t xml:space="preserve">illustrates </w:t>
+      </w:r>
+      <w:r>
+        <w:rPr>
+          <w:rFonts w:ascii="Garamond" w:hAnsi="Garamond"/>
+        </w:rPr>
+        <w:t>an</w:t>
+      </w:r>
+      <w:r>
+        <w:rPr>
+          <w:rFonts w:ascii="Garamond" w:hAnsi="Garamond"/>
+        </w:rPr>
+        <w:t xml:space="preserve"> </w:t>
+      </w:r>
+      <w:r>
+        <w:rPr>
+          <w:rFonts w:ascii="Garamond" w:hAnsi="Garamond"/>
+        </w:rPr>
+        <w:t xml:space="preserve">approach </w:t>
+      </w:r>
+      <w:r>
+        <w:rPr>
+          <w:rFonts w:ascii="Garamond" w:hAnsi="Garamond"/>
+        </w:rPr>
+        <w:t xml:space="preserve">that can be used alongside </w:t>
+      </w:r>
+      <w:r>
+        <w:rPr>
+          <w:rFonts w:ascii="Garamond" w:hAnsi="Garamond"/>
+        </w:rPr>
+        <w:t>otolith LA-ICPMS data</w:t>
+      </w:r>
+      <w:r>
+        <w:rPr>
+          <w:rFonts w:ascii="Garamond" w:hAnsi="Garamond"/>
+        </w:rPr>
+        <w:t xml:space="preserve"> to provide probabilistic estimates of provenance, and calibrated models presented here may be immediately useful for classifying adult Chinook salmon from western Alaska watershed. </w:t>
+      </w:r>
+      <w:r>
+        <w:rPr>
+          <w:rFonts w:ascii="Garamond" w:hAnsi="Garamond"/>
+        </w:rPr>
+        <w:t>Because of the size of this dataset and the temporal scale of sampling efforts, we expect that th</w:t>
+      </w:r>
+      <w:r>
+        <w:rPr>
+          <w:rFonts w:ascii="Garamond" w:hAnsi="Garamond"/>
+        </w:rPr>
+        <w:t>e library of otolith data included in this model includes variability among years that will allow it to perform well on new data</w:t>
+      </w:r>
+      <w:r>
+        <w:rPr>
+          <w:rFonts w:ascii="Garamond" w:hAnsi="Garamond"/>
+        </w:rPr>
+        <w:t>sets</w:t>
+      </w:r>
+      <w:r>
+        <w:rPr>
+          <w:rFonts w:ascii="Garamond" w:hAnsi="Garamond"/>
+        </w:rPr>
+        <w:t xml:space="preserve">. However, because we opted not to include a true validation set given sample-size constraints, there remains the potential that performance on a new year may be lower due to overfitting to our dataset. In addition, because these data include only the juvenile freshwater residence </w:t>
+      </w:r>
+      <w:r>
+        <w:rPr>
+          <w:rFonts w:ascii="Garamond" w:hAnsi="Garamond"/>
+        </w:rPr>
+        <w:t xml:space="preserve">period, we expect that this model can be applied to juvenile chinook salmon expected to be from western Alaska watersheds. However, this assumption should be tested using known-origin individuals before large scale implementation. </w:t>
+      </w:r>
+    </w:p>
+    <w:p>
+      <w:pPr>
+        <w:pStyle w:val="whitespace-normal"/>
+        <w:spacing w:line="480" w:lineRule="auto"/>
+        <w:ind w:firstLine="720"/>
+        <w:rPr>
+          <w:rFonts w:ascii="Garamond" w:hAnsi="Garamond"/>
+        </w:rPr>
+      </w:pPr>
+      <w:r>
+        <w:rPr>
+          <w:rFonts w:ascii="Garamond" w:hAnsi="Garamond"/>
+        </w:rPr>
+        <w:lastRenderedPageBreak/>
+        <w:t>In addition, the methods presented here provide quantifiable confidence values which can be directly used by managers to make decisions based on changing thresholds of misassignment risk, offering a practical framework for incorporating uncertainty into management decisions.</w:t>
+      </w:r>
+      <w:r>
+        <w:rPr>
+          <w:rFonts w:ascii="Garamond" w:hAnsi="Garamond"/>
+        </w:rPr>
+        <w:t xml:space="preserve"> Even with extremely high confidence threshold values, our model achieved between ~70% and ~85% accuracy for all classes. The exception to this is the Yukon classification on the “Total” testing set, in which distinct </w:t>
+      </w:r>
+      <w:r>
+        <w:rPr>
+          <w:rFonts w:ascii="Cambria Math" w:hAnsi="Cambria Math" w:cs="Cambria Math"/>
+          <w:sz w:val="22"/>
+          <w:szCs w:val="22"/>
+        </w:rPr>
+        <w:t>⁸⁷</w:t>
+      </w:r>
+      <w:r>
+        <w:rPr>
+          <w:rFonts w:ascii="Garamond" w:hAnsi="Garamond"/>
+          <w:sz w:val="22"/>
+          <w:szCs w:val="22"/>
+        </w:rPr>
+        <w:t>Sr/</w:t>
+      </w:r>
+      <w:r>
+        <w:rPr>
+          <w:rFonts w:ascii="Cambria Math" w:hAnsi="Cambria Math" w:cs="Cambria Math"/>
+          <w:sz w:val="22"/>
+          <w:szCs w:val="22"/>
+        </w:rPr>
+        <w:t>⁸⁶</w:t>
+      </w:r>
+      <w:r>
+        <w:rPr>
+          <w:rFonts w:ascii="Garamond" w:hAnsi="Garamond"/>
+          <w:sz w:val="22"/>
+          <w:szCs w:val="22"/>
+        </w:rPr>
+        <w:t>Sr</w:t>
+      </w:r>
+      <w:r>
+        <w:rPr>
+          <w:rFonts w:ascii="Garamond" w:hAnsi="Garamond"/>
+          <w:sz w:val="22"/>
+          <w:szCs w:val="22"/>
+        </w:rPr>
+        <w:t xml:space="preserve"> values in the Yukon buoy correct classification with extremely high confidence </w:t>
+      </w:r>
+      <w:commentRangeStart w:id="12"/>
+      <w:r>
+        <w:rPr>
+          <w:rFonts w:ascii="Garamond" w:hAnsi="Garamond"/>
+          <w:sz w:val="22"/>
+          <w:szCs w:val="22"/>
+        </w:rPr>
+        <w:t>values</w:t>
+      </w:r>
+      <w:commentRangeEnd w:id="12"/>
       <w:r>
         <w:rPr>
           <w:rStyle w:val="CommentReference"/>
@@ -6563,148 +6981,7 @@
           <w:kern w:val="2"/>
           <w14:ligatures w14:val="standardContextual"/>
         </w:rPr>
-        <w:commentReference w:id="15"/>
-      </w:r>
-      <w:r>
-        <w:rPr>
-          <w:rFonts w:ascii="Garamond" w:hAnsi="Garamond"/>
-        </w:rPr>
-        <w:t xml:space="preserve"> presented here provide an immediately available </w:t>
-      </w:r>
-      <w:commentRangeStart w:id="16"/>
-      <w:r>
-        <w:rPr>
-          <w:rFonts w:ascii="Garamond" w:hAnsi="Garamond"/>
-        </w:rPr>
-        <w:t>tool</w:t>
-      </w:r>
-      <w:commentRangeEnd w:id="16"/>
-      <w:r>
-        <w:rPr>
-          <w:rStyle w:val="CommentReference"/>
-          <w:rFonts w:asciiTheme="minorHAnsi" w:eastAsiaTheme="minorHAnsi" w:hAnsiTheme="minorHAnsi" w:cstheme="minorBidi"/>
-          <w:kern w:val="2"/>
-          <w14:ligatures w14:val="standardContextual"/>
-        </w:rPr>
-        <w:commentReference w:id="16"/>
-      </w:r>
-      <w:r>
-        <w:rPr>
-          <w:rFonts w:ascii="Garamond" w:hAnsi="Garamond"/>
-        </w:rPr>
-        <w:t xml:space="preserve"> </w:t>
-      </w:r>
-      <w:r>
-        <w:rPr>
-          <w:rFonts w:ascii="Garamond" w:hAnsi="Garamond"/>
-        </w:rPr>
-        <w:t xml:space="preserve">that can be used alongside </w:t>
-      </w:r>
-      <w:r>
-        <w:rPr>
-          <w:rFonts w:ascii="Garamond" w:hAnsi="Garamond"/>
-        </w:rPr>
-        <w:t>otolith LA-ICPMS data</w:t>
-      </w:r>
-      <w:r>
-        <w:rPr>
-          <w:rFonts w:ascii="Garamond" w:hAnsi="Garamond"/>
-        </w:rPr>
-        <w:t xml:space="preserve">. </w:t>
-      </w:r>
-      <w:commentRangeStart w:id="17"/>
-      <w:r>
-        <w:rPr>
-          <w:rFonts w:ascii="Garamond" w:hAnsi="Garamond"/>
-        </w:rPr>
-        <w:t>Because of the size of this dataset and the temporal scale of sampling efforts, we expect that this model will perform well on new datasets despite shifting patterns of habitat use throughout the basin which may alter the shape of otolith timeseries data.</w:t>
-      </w:r>
-      <w:commentRangeEnd w:id="17"/>
-      <w:r>
-        <w:rPr>
-          <w:rStyle w:val="CommentReference"/>
-          <w:rFonts w:asciiTheme="minorHAnsi" w:eastAsiaTheme="minorHAnsi" w:hAnsiTheme="minorHAnsi" w:cstheme="minorBidi"/>
-          <w:kern w:val="2"/>
-          <w14:ligatures w14:val="standardContextual"/>
-        </w:rPr>
-        <w:commentReference w:id="17"/>
-      </w:r>
-      <w:r>
-        <w:rPr>
-          <w:rFonts w:ascii="Garamond" w:hAnsi="Garamond"/>
-        </w:rPr>
-        <w:t xml:space="preserve"> </w:t>
-      </w:r>
-      <w:r>
-        <w:rPr>
-          <w:rFonts w:ascii="Garamond" w:hAnsi="Garamond"/>
-        </w:rPr>
-        <w:t>In addition, the methods presented here provide quantifiable confidence values which can be directly used by managers to make decisions based on changing thresholds of misassignment risk, offering a practical framework for incorporating uncertainty into management decisions.</w:t>
-      </w:r>
-      <w:r>
-        <w:rPr>
-          <w:rFonts w:ascii="Garamond" w:hAnsi="Garamond"/>
-        </w:rPr>
-        <w:t xml:space="preserve"> Even with extremely high confidence threshold values, our model achieved between ~70% and ~85% accuracy for all classes. The exception to this is the Yukon classification on the “Total” testing set, in which distinct </w:t>
-      </w:r>
-      <w:r>
-        <w:rPr>
-          <w:rFonts w:ascii="Cambria Math" w:hAnsi="Cambria Math" w:cs="Cambria Math"/>
-          <w:sz w:val="22"/>
-          <w:szCs w:val="22"/>
-        </w:rPr>
-        <w:t>⁸⁷</w:t>
-      </w:r>
-      <w:r>
-        <w:rPr>
-          <w:rFonts w:ascii="Garamond" w:hAnsi="Garamond"/>
-          <w:sz w:val="22"/>
-          <w:szCs w:val="22"/>
-        </w:rPr>
-        <w:t>Sr/</w:t>
-      </w:r>
-      <w:r>
-        <w:rPr>
-          <w:rFonts w:ascii="Cambria Math" w:hAnsi="Cambria Math" w:cs="Cambria Math"/>
-          <w:sz w:val="22"/>
-          <w:szCs w:val="22"/>
-        </w:rPr>
-        <w:t>⁸⁶</w:t>
-      </w:r>
-      <w:r>
-        <w:rPr>
-          <w:rFonts w:ascii="Garamond" w:hAnsi="Garamond"/>
-          <w:sz w:val="22"/>
-          <w:szCs w:val="22"/>
-        </w:rPr>
-        <w:t>Sr</w:t>
-      </w:r>
-      <w:r>
-        <w:rPr>
-          <w:rFonts w:ascii="Garamond" w:hAnsi="Garamond"/>
-          <w:sz w:val="22"/>
-          <w:szCs w:val="22"/>
-        </w:rPr>
-        <w:t xml:space="preserve"> values in the Yukon buoy correct classification with extremely high confidence </w:t>
-      </w:r>
-      <w:commentRangeStart w:id="18"/>
-      <w:r>
-        <w:rPr>
-          <w:rFonts w:ascii="Garamond" w:hAnsi="Garamond"/>
-          <w:sz w:val="22"/>
-          <w:szCs w:val="22"/>
-        </w:rPr>
-        <w:t>values</w:t>
-      </w:r>
-      <w:commentRangeEnd w:id="18"/>
-      <w:r>
-        <w:rPr>
-          <w:rStyle w:val="CommentReference"/>
-          <w:rFonts w:asciiTheme="minorHAnsi" w:eastAsiaTheme="minorHAnsi" w:hAnsiTheme="minorHAnsi" w:cstheme="minorBidi"/>
-          <w:kern w:val="2"/>
-          <w14:ligatures w14:val="standardContextual"/>
-        </w:rPr>
-        <w:commentReference w:id="18"/>
+        <w:commentReference w:id="12"/>
       </w:r>
       <w:r>
         <w:rPr>
@@ -6732,7 +7009,6 @@
           <w:sz w:val="22"/>
           <w:szCs w:val="22"/>
         </w:rPr>
-        <w:lastRenderedPageBreak/>
         <w:t>Although the methods presented here advance the ability to discriminate among rivers for Western Alaska Chinook salmon, they remain limited for in-season management or rapid research applications. Otolith LA-ICPMS is costly and labor-intensive, making large-scale, real-time assessment of river origin for marine-caught samples impractical. Moreover, otolith collection is lethal, which may be prohibitive given the increasingly endangered status of Chinook salmon in this region. The model also relies on a large existing dataset with known river-of-origin labels derived from unique sampling efforts, a resource not available for most other species of concern. For example, comparable datasets do not exist for chum salmon, constraining the broader application of these methods across species.</w:t>
       </w:r>
     </w:p>
@@ -6747,7 +7023,7 @@
           <w:szCs w:val="22"/>
         </w:rPr>
       </w:pPr>
-      <w:commentRangeStart w:id="19"/>
+      <w:commentRangeStart w:id="13"/>
       <w:r>
         <w:rPr>
           <w:rFonts w:ascii="Garamond" w:hAnsi="Garamond"/>
@@ -6756,12 +7032,12 @@
         </w:rPr>
         <w:t>Cutting edge statistical tools such as machine learning models</w:t>
       </w:r>
-      <w:commentRangeEnd w:id="19"/>
+      <w:commentRangeEnd w:id="13"/>
       <w:r>
         <w:rPr>
           <w:rStyle w:val="CommentReference"/>
         </w:rPr>
-        <w:commentReference w:id="19"/>
+        <w:commentReference w:id="13"/>
       </w:r>
       <w:r>
         <w:rPr>
@@ -6777,19 +7053,17 @@
           <w:sz w:val="22"/>
           <w:szCs w:val="22"/>
         </w:rPr>
-        <w:t>Developing this knowledge of ecosystem function across scales is essential for informing management and conservation strategies that sustain the services provided by healthy, functioning ecosystems.</w:t>
+        <w:t>Developing this knowledge of ecosystem function across scales is essential for informing management and conservation strategies that sustain the services provided by healthy, functioning ecosystems</w:t>
+      </w:r>
+      <w:r>
+        <w:rPr>
+          <w:rFonts w:ascii="Garamond" w:hAnsi="Garamond"/>
+          <w:sz w:val="22"/>
+          <w:szCs w:val="22"/>
+        </w:rPr>
+        <w:t xml:space="preserve">. </w:t>
       </w:r>
     </w:p>
-    <w:p>
-      <w:pPr>
-        <w:spacing w:before="100" w:beforeAutospacing="1" w:after="100" w:afterAutospacing="1" w:line="480" w:lineRule="auto"/>
-        <w:outlineLvl w:val="1"/>
-        <w:rPr>
-          <w:rFonts w:ascii="Garamond" w:hAnsi="Garamond"/>
-        </w:rPr>
-      </w:pPr>
-    </w:p>
-    <w:p/>
     <w:sectPr>
       <w:pgSz w:w="12240" w:h="15840"/>
       <w:pgMar w:top="1440" w:right="1440" w:bottom="1440" w:left="1440" w:header="720" w:footer="720" w:gutter="0"/>
@@ -6837,7 +7111,7 @@
       </w:r>
     </w:p>
   </w:comment>
-  <w:comment w:id="2" w:author="Valentina M. Staneva" w:date="2025-09-27T17:02:00Z" w:initials="VMS">
+  <w:comment w:id="2" w:author="Benjamin J. Makhlouf" w:date="2025-09-30T09:11:00Z" w:initials="b">
     <w:p>
       <w:r>
         <w:rPr>
@@ -6850,11 +7124,11 @@
           <w:sz w:val="20"/>
           <w:szCs w:val="20"/>
         </w:rPr>
-        <w:t>specify from which library otherwise it might not mean anything to people.</w:t>
+        <w:t>Cite Tidymodels</w:t>
       </w:r>
     </w:p>
   </w:comment>
-  <w:comment w:id="3" w:author="Benjamin J. Makhlouf" w:date="2025-09-02T09:56:00Z" w:initials="b">
+  <w:comment w:id="3" w:author="Valentina M. Staneva" w:date="2025-09-27T17:02:00Z" w:initials="VMS">
     <w:p>
       <w:r>
         <w:rPr>
@@ -6867,11 +7141,11 @@
           <w:sz w:val="20"/>
           <w:szCs w:val="20"/>
         </w:rPr>
-        <w:t xml:space="preserve">I did not iterate through hyperparameters, just chose them and trained on training data. Does this convey that? </w:t>
+        <w:t>specify from which library otherwise it might not mean anything to people.</w:t>
       </w:r>
     </w:p>
   </w:comment>
-  <w:comment w:id="4" w:author="Valentina M. Staneva" w:date="2025-09-29T08:09:00Z" w:initials="VMS">
+  <w:comment w:id="4" w:author="Benjamin J. Makhlouf" w:date="2025-09-02T09:56:00Z" w:initials="b">
     <w:p>
       <w:r>
         <w:rPr>
@@ -6884,7 +7158,7 @@
           <w:sz w:val="20"/>
           <w:szCs w:val="20"/>
         </w:rPr>
-        <w:t>Maybe confidence scores? This is often used for non-probabilistic classifiers like neural networks which artificially convert values between -inf, inf to (0,1). Confidence levels makes me think of confidence intervals which is a separate notion.</w:t>
+        <w:t xml:space="preserve">I did not iterate through hyperparameters, just chose them and trained on training data. Does this convey that? </w:t>
       </w:r>
     </w:p>
   </w:comment>
@@ -6956,7 +7230,7 @@
       </w:r>
     </w:p>
   </w:comment>
-  <w:comment w:id="9" w:author="Valentina M. Staneva" w:date="2025-09-28T13:36:00Z" w:initials="VMS">
+  <w:comment w:id="9" w:author="Valentina M. Staneva" w:date="2025-09-29T10:51:00Z" w:initials="VMS">
     <w:p>
       <w:r>
         <w:rPr>
@@ -6969,11 +7243,11 @@
           <w:sz w:val="20"/>
           <w:szCs w:val="20"/>
         </w:rPr>
-        <w:t>have</w:t>
+        <w:t>Is this after calibration?</w:t>
       </w:r>
     </w:p>
   </w:comment>
-  <w:comment w:id="10" w:author="Valentina M. Staneva" w:date="2025-09-29T10:51:00Z" w:initials="VMS">
+  <w:comment w:id="10" w:author="Valentina M. Staneva" w:date="2025-09-28T16:25:00Z" w:initials="VMS">
     <w:p>
       <w:r>
         <w:rPr>
@@ -6986,11 +7260,11 @@
           <w:sz w:val="20"/>
           <w:szCs w:val="20"/>
         </w:rPr>
-        <w:t>Is this after calibration?</w:t>
+        <w:t>language regarding time-series analysis techniques</w:t>
       </w:r>
     </w:p>
   </w:comment>
-  <w:comment w:id="11" w:author="Valentina M. Staneva" w:date="2025-09-28T16:25:00Z" w:initials="VMS">
+  <w:comment w:id="11" w:author="Valentina M. Staneva" w:date="2025-09-28T16:28:00Z" w:initials="VMS">
     <w:p>
       <w:r>
         <w:rPr>
@@ -7003,11 +7277,11 @@
           <w:sz w:val="20"/>
           <w:szCs w:val="20"/>
         </w:rPr>
-        <w:t>language regarding time-series analysis techniques</w:t>
+        <w:t>which?</w:t>
       </w:r>
     </w:p>
   </w:comment>
-  <w:comment w:id="12" w:author="Valentina M. Staneva" w:date="2025-09-28T16:26:00Z" w:initials="VMS">
+  <w:comment w:id="12" w:author="Valentina M. Staneva" w:date="2025-09-28T18:30:00Z" w:initials="VMS">
     <w:p>
       <w:r>
         <w:rPr>
@@ -7020,113 +7294,11 @@
           <w:sz w:val="20"/>
           <w:szCs w:val="20"/>
         </w:rPr>
-        <w:t>repetition</w:t>
+        <w:t xml:space="preserve">Could add that the whole approach is rather general and can be implemented for other such data (other fish, other region). </w:t>
       </w:r>
     </w:p>
   </w:comment>
-  <w:comment w:id="13" w:author="Valentina M. Staneva" w:date="2025-09-28T16:28:00Z" w:initials="VMS">
-    <w:p>
-      <w:r>
-        <w:rPr>
-          <w:rStyle w:val="CommentReference"/>
-        </w:rPr>
-        <w:annotationRef/>
-      </w:r>
-      <w:r>
-        <w:rPr>
-          <w:sz w:val="20"/>
-          <w:szCs w:val="20"/>
-        </w:rPr>
-        <w:t>repetition</w:t>
-      </w:r>
-    </w:p>
-  </w:comment>
-  <w:comment w:id="14" w:author="Valentina M. Staneva" w:date="2025-09-28T16:28:00Z" w:initials="VMS">
-    <w:p>
-      <w:r>
-        <w:rPr>
-          <w:rStyle w:val="CommentReference"/>
-        </w:rPr>
-        <w:annotationRef/>
-      </w:r>
-      <w:r>
-        <w:rPr>
-          <w:sz w:val="20"/>
-          <w:szCs w:val="20"/>
-        </w:rPr>
-        <w:t>which?</w:t>
-      </w:r>
-    </w:p>
-  </w:comment>
-  <w:comment w:id="15" w:author="Valentina M. Staneva" w:date="2025-09-28T18:17:00Z" w:initials="VMS">
-    <w:p>
-      <w:r>
-        <w:rPr>
-          <w:rStyle w:val="CommentReference"/>
-        </w:rPr>
-        <w:annotationRef/>
-      </w:r>
-      <w:r>
-        <w:rPr>
-          <w:sz w:val="20"/>
-          <w:szCs w:val="20"/>
-        </w:rPr>
-        <w:t>workflow? to represent the whole pipeline</w:t>
-      </w:r>
-    </w:p>
-  </w:comment>
-  <w:comment w:id="16" w:author="Valentina M. Staneva" w:date="2025-09-28T18:18:00Z" w:initials="VMS">
-    <w:p>
-      <w:r>
-        <w:rPr>
-          <w:rStyle w:val="CommentReference"/>
-        </w:rPr>
-        <w:annotationRef/>
-      </w:r>
-      <w:r>
-        <w:rPr>
-          <w:sz w:val="20"/>
-          <w:szCs w:val="20"/>
-        </w:rPr>
-        <w:t>approach?</w:t>
-      </w:r>
-    </w:p>
-  </w:comment>
-  <w:comment w:id="17" w:author="Valentina M. Staneva" w:date="2025-09-28T17:11:00Z" w:initials="VMS">
-    <w:p>
-      <w:r>
-        <w:rPr>
-          <w:rStyle w:val="CommentReference"/>
-        </w:rPr>
-        <w:annotationRef/>
-      </w:r>
-      <w:r>
-        <w:rPr>
-          <w:sz w:val="20"/>
-          <w:szCs w:val="20"/>
-        </w:rPr>
-        <w:t>This may not be obvious from the size of the dataset. A reviewer will most probably ask about performance with "leave one out year" or some other generalizability testing experiments.</w:t>
-      </w:r>
-    </w:p>
-  </w:comment>
-  <w:comment w:id="18" w:author="Valentina M. Staneva" w:date="2025-09-28T18:30:00Z" w:initials="VMS">
-    <w:p>
-      <w:r>
-        <w:rPr>
-          <w:rStyle w:val="CommentReference"/>
-        </w:rPr>
-        <w:annotationRef/>
-      </w:r>
-      <w:r>
-        <w:rPr>
-          <w:sz w:val="20"/>
-          <w:szCs w:val="20"/>
-        </w:rPr>
-        <w:t xml:space="preserve">Could add that the whole approach is rather general and can be implemented for other such data (other fish, other region). </w:t>
-      </w:r>
-    </w:p>
-  </w:comment>
-  <w:comment w:id="19" w:author="Valentina M. Staneva" w:date="2025-09-28T18:15:00Z" w:initials="VMS">
+  <w:comment w:id="13" w:author="Valentina M. Staneva" w:date="2025-09-28T18:15:00Z" w:initials="VMS">
     <w:p>
       <w:r>
         <w:rPr>
@@ -7150,22 +7322,16 @@
 <w15:commentsEx xmlns:wpc="http://schemas.microsoft.com/office/word/2010/wordprocessingCanvas" xmlns:cx="http://schemas.microsoft.com/office/drawing/2014/chartex" xmlns:cx1="http://schemas.microsoft.com/office/drawing/2015/9/8/chartex" xmlns:cx2="http://schemas.microsoft.com/office/drawing/2015/10/21/chartex" xmlns:cx3="http://schemas.microsoft.com/office/drawing/2016/5/9/chartex" xmlns:cx4="http://schemas.microsoft.com/office/drawing/2016/5/10/chartex" xmlns:cx5="http://schemas.microsoft.com/office/drawing/2016/5/11/chartex" xmlns:cx6="http://schemas.microsoft.com/office/drawing/2016/5/12/chartex" xmlns:cx7="http://schemas.microsoft.com/office/drawing/2016/5/13/chartex" xmlns:cx8="http://schemas.microsoft.com/office/drawing/2016/5/14/chartex" xmlns:mc="http://schemas.openxmlformats.org/markup-compatibility/2006" xmlns:aink="http://schemas.microsoft.com/office/drawing/2016/ink" xmlns:am3d="http://schemas.microsoft.com/office/drawing/2017/model3d" xmlns:o="urn:schemas-microsoft-com:office:office" xmlns:oel="http://schemas.microsoft.com/office/2019/extlst" xmlns:r="http://schemas.openxmlformats.org/officeDocument/2006/relationships" xmlns:m="http://schemas.openxmlformats.org/officeDocument/2006/math" xmlns:v="urn:schemas-microsoft-com:vml" xmlns:wp14="http://schemas.microsoft.com/office/word/2010/wordprocessingDrawing" xmlns:wp="http://schemas.openxmlformats.org/drawingml/2006/wordprocessingDrawing" xmlns:w10="urn:schemas-microsoft-com:office:word" xmlns:w="http://schemas.openxmlformats.org/wordprocessingml/2006/main" xmlns:w14="http://schemas.microsoft.com/office/word/2010/wordml" xmlns:w15="http://schemas.microsoft.com/office/word/2012/wordml" xmlns:w16cex="http://schemas.microsoft.com/office/word/2018/wordml/cex" xmlns:w16cid="http://schemas.microsoft.com/office/word/2016/wordml/cid" xmlns:w16="http://schemas.microsoft.com/office/word/2018/wordml" xmlns:w16du="http://schemas.microsoft.com/office/word/2023/wordml/word16du" xmlns:w16sdtdh="http://schemas.microsoft.com/office/word/2020/wordml/sdtdatahash" xmlns:w16sdtfl="http://schemas.microsoft.com/office/word/2024/wordml/sdtformatlock" xmlns:w16se="http://schemas.microsoft.com/office/word/2015/wordml/symex" xmlns:wpg="http://schemas.microsoft.com/office/word/2010/wordprocessingGroup" xmlns:wpi="http://schemas.microsoft.com/office/word/2010/wordprocessingInk" xmlns:wne="http://schemas.microsoft.com/office/word/2006/wordml" xmlns:wps="http://schemas.microsoft.com/office/word/2010/wordprocessingShape" mc:Ignorable="w14 w15 w16se w16cid w16 w16cex w16sdtdh w16sdtfl w16du wp14">
   <w15:commentEx w15:paraId="678C87C1" w15:done="0"/>
   <w15:commentEx w15:paraId="51CBD6D1" w15:done="0"/>
-  <w15:commentEx w15:paraId="06C0E272" w15:done="0"/>
-  <w15:commentEx w15:paraId="4E3434D0" w15:done="0"/>
-  <w15:commentEx w15:paraId="5992D838" w15:done="0"/>
-  <w15:commentEx w15:paraId="3471AB53" w15:done="0"/>
+  <w15:commentEx w15:paraId="03EE4563" w15:done="0"/>
+  <w15:commentEx w15:paraId="06C0E272" w15:done="1"/>
+  <w15:commentEx w15:paraId="4E3434D0" w15:done="1"/>
+  <w15:commentEx w15:paraId="3471AB53" w15:done="1"/>
   <w15:commentEx w15:paraId="148A0BEE" w15:done="0"/>
   <w15:commentEx w15:paraId="55BD51FF" w15:paraIdParent="148A0BEE" w15:done="0"/>
   <w15:commentEx w15:paraId="7EA423C7" w15:done="0"/>
-  <w15:commentEx w15:paraId="2440C49E" w15:done="0"/>
-  <w15:commentEx w15:paraId="00A06E06" w15:done="0"/>
-  <w15:commentEx w15:paraId="31E84DFE" w15:done="0"/>
-  <w15:commentEx w15:paraId="39DF07D9" w15:done="0"/>
-  <w15:commentEx w15:paraId="4C0DBE43" w15:done="0"/>
-  <w15:commentEx w15:paraId="7D7AD7A5" w15:done="0"/>
-  <w15:commentEx w15:paraId="7FC345B2" w15:done="0"/>
-  <w15:commentEx w15:paraId="4D121C52" w15:done="0"/>
-  <w15:commentEx w15:paraId="1CC502A4" w15:done="0"/>
+  <w15:commentEx w15:paraId="00A06E06" w15:done="1"/>
+  <w15:commentEx w15:paraId="31E84DFE" w15:done="1"/>
+  <w15:commentEx w15:paraId="7D7AD7A5" w15:done="1"/>
   <w15:commentEx w15:paraId="2B055E78" w15:done="0"/>
   <w15:commentEx w15:paraId="540E6716" w15:done="0"/>
 </w15:commentsEx>
@@ -7175,22 +7341,16 @@
 <w16cex:commentsExtensible xmlns:wpc="http://schemas.microsoft.com/office/word/2010/wordprocessingCanvas" xmlns:cx="http://schemas.microsoft.com/office/drawing/2014/chartex" xmlns:cx1="http://schemas.microsoft.com/office/drawing/2015/9/8/chartex" xmlns:cx2="http://schemas.microsoft.com/office/drawing/2015/10/21/chartex" xmlns:cx3="http://schemas.microsoft.com/office/drawing/2016/5/9/chartex" xmlns:cx4="http://schemas.microsoft.com/office/drawing/2016/5/10/chartex" xmlns:cx5="http://schemas.microsoft.com/office/drawing/2016/5/11/chartex" xmlns:cx6="http://schemas.microsoft.com/office/drawing/2016/5/12/chartex" xmlns:cx7="http://schemas.microsoft.com/office/drawing/2016/5/13/chartex" xmlns:cx8="http://schemas.microsoft.com/office/drawing/2016/5/14/chartex" xmlns:cr="http://schemas.microsoft.com/office/comments/2020/reactions" xmlns:mc="http://schemas.openxmlformats.org/markup-compatibility/2006" xmlns:aink="http://schemas.microsoft.com/office/drawing/2016/ink" xmlns:am3d="http://schemas.microsoft.com/office/drawing/2017/model3d" xmlns:o="urn:schemas-microsoft-com:office:office" xmlns:oel="http://schemas.microsoft.com/office/2019/extlst" xmlns:r="http://schemas.openxmlformats.org/officeDocument/2006/relationships" xmlns:m="http://schemas.openxmlformats.org/officeDocument/2006/math" xmlns:v="urn:schemas-microsoft-com:vml" xmlns:wp14="http://schemas.microsoft.com/office/word/2010/wordprocessingDrawing" xmlns:wp="http://schemas.openxmlformats.org/drawingml/2006/wordprocessingDrawing" xmlns:w10="urn:schemas-microsoft-com:office:word" xmlns:w="http://schemas.openxmlformats.org/wordprocessingml/2006/main" xmlns:w14="http://schemas.microsoft.com/office/word/2010/wordml" xmlns:w15="http://schemas.microsoft.com/office/word/2012/wordml" xmlns:w16cex="http://schemas.microsoft.com/office/word/2018/wordml/cex" xmlns:w16cid="http://schemas.microsoft.com/office/word/2016/wordml/cid" xmlns:w16="http://schemas.microsoft.com/office/word/2018/wordml" xmlns:w16du="http://schemas.microsoft.com/office/word/2023/wordml/word16du" xmlns:w16sdtdh="http://schemas.microsoft.com/office/word/2020/wordml/sdtdatahash" xmlns:w16sdtfl="http://schemas.microsoft.com/office/word/2024/wordml/sdtformatlock" xmlns:w16se="http://schemas.microsoft.com/office/word/2015/wordml/symex" xmlns:wpg="http://schemas.microsoft.com/office/word/2010/wordprocessingGroup" xmlns:wpi="http://schemas.microsoft.com/office/word/2010/wordprocessingInk" xmlns:wne="http://schemas.microsoft.com/office/word/2006/wordml" xmlns:wps="http://schemas.microsoft.com/office/word/2010/wordprocessingShape" mc:Ignorable="w14 w15 w16se w16cid w16 w16cex w16sdtdh w16sdtfl cr w16du wp14">
   <w16cex:commentExtensible w16cex:durableId="79E2A6E3" w16cex:dateUtc="2025-09-06T23:49:00Z"/>
   <w16cex:commentExtensible w16cex:durableId="6197010A" w16cex:dateUtc="2025-08-18T18:18:00Z"/>
+  <w16cex:commentExtensible w16cex:durableId="2C82FAB6" w16cex:dateUtc="2025-09-30T16:11:00Z"/>
   <w16cex:commentExtensible w16cex:durableId="777EB87E" w16cex:dateUtc="2025-09-28T00:02:00Z"/>
   <w16cex:commentExtensible w16cex:durableId="208C7FE7" w16cex:dateUtc="2025-09-02T16:56:00Z"/>
-  <w16cex:commentExtensible w16cex:durableId="37C95A50" w16cex:dateUtc="2025-09-29T15:09:00Z"/>
   <w16cex:commentExtensible w16cex:durableId="0E92A1BC" w16cex:dateUtc="2025-09-29T15:12:00Z"/>
   <w16cex:commentExtensible w16cex:durableId="0444BDF2" w16cex:dateUtc="2025-09-29T15:43:00Z"/>
   <w16cex:commentExtensible w16cex:durableId="1AE1AF2B" w16cex:dateUtc="2025-09-29T15:46:00Z"/>
   <w16cex:commentExtensible w16cex:durableId="7BF59F8C" w16cex:dateUtc="2025-09-07T00:57:00Z"/>
-  <w16cex:commentExtensible w16cex:durableId="539ED425" w16cex:dateUtc="2025-09-28T20:36:00Z"/>
   <w16cex:commentExtensible w16cex:durableId="37956EA5" w16cex:dateUtc="2025-09-29T17:51:00Z"/>
   <w16cex:commentExtensible w16cex:durableId="7B5EF19A" w16cex:dateUtc="2025-09-28T23:25:00Z"/>
-  <w16cex:commentExtensible w16cex:durableId="6CD49BFE" w16cex:dateUtc="2025-09-28T23:26:00Z"/>
-  <w16cex:commentExtensible w16cex:durableId="69FA1417" w16cex:dateUtc="2025-09-28T23:28:00Z"/>
   <w16cex:commentExtensible w16cex:durableId="7C4DD3A0" w16cex:dateUtc="2025-09-28T23:28:00Z"/>
-  <w16cex:commentExtensible w16cex:durableId="174F3C13" w16cex:dateUtc="2025-09-29T01:17:00Z"/>
-  <w16cex:commentExtensible w16cex:durableId="6A3F06CB" w16cex:dateUtc="2025-09-29T01:18:00Z"/>
-  <w16cex:commentExtensible w16cex:durableId="6B055EF6" w16cex:dateUtc="2025-09-29T00:11:00Z"/>
   <w16cex:commentExtensible w16cex:durableId="22307157" w16cex:dateUtc="2025-09-29T01:30:00Z"/>
   <w16cex:commentExtensible w16cex:durableId="57669968" w16cex:dateUtc="2025-09-29T01:15:00Z"/>
 </w16cex:commentsExtensible>
@@ -7200,22 +7360,16 @@
 <w16cid:commentsIds xmlns:wpc="http://schemas.microsoft.com/office/word/2010/wordprocessingCanvas" xmlns:cx="http://schemas.microsoft.com/office/drawing/2014/chartex" xmlns:cx1="http://schemas.microsoft.com/office/drawing/2015/9/8/chartex" xmlns:cx2="http://schemas.microsoft.com/office/drawing/2015/10/21/chartex" xmlns:cx3="http://schemas.microsoft.com/office/drawing/2016/5/9/chartex" xmlns:cx4="http://schemas.microsoft.com/office/drawing/2016/5/10/chartex" xmlns:cx5="http://schemas.microsoft.com/office/drawing/2016/5/11/chartex" xmlns:cx6="http://schemas.microsoft.com/office/drawing/2016/5/12/chartex" xmlns:cx7="http://schemas.microsoft.com/office/drawing/2016/5/13/chartex" xmlns:cx8="http://schemas.microsoft.com/office/drawing/2016/5/14/chartex" xmlns:mc="http://schemas.openxmlformats.org/markup-compatibility/2006" xmlns:aink="http://schemas.microsoft.com/office/drawing/2016/ink" xmlns:am3d="http://schemas.microsoft.com/office/drawing/2017/model3d" xmlns:o="urn:schemas-microsoft-com:office:office" xmlns:oel="http://schemas.microsoft.com/office/2019/extlst" xmlns:r="http://schemas.openxmlformats.org/officeDocument/2006/relationships" xmlns:m="http://schemas.openxmlformats.org/officeDocument/2006/math" xmlns:v="urn:schemas-microsoft-com:vml" xmlns:wp14="http://schemas.microsoft.com/office/word/2010/wordprocessingDrawing" xmlns:wp="http://schemas.openxmlformats.org/drawingml/2006/wordprocessingDrawing" xmlns:w10="urn:schemas-microsoft-com:office:word" xmlns:w="http://schemas.openxmlformats.org/wordprocessingml/2006/main" xmlns:w14="http://schemas.microsoft.com/office/word/2010/wordml" xmlns:w15="http://schemas.microsoft.com/office/word/2012/wordml" xmlns:w16cex="http://schemas.microsoft.com/office/word/2018/wordml/cex" xmlns:w16cid="http://schemas.microsoft.com/office/word/2016/wordml/cid" xmlns:w16="http://schemas.microsoft.com/office/word/2018/wordml" xmlns:w16du="http://schemas.microsoft.com/office/word/2023/wordml/word16du" xmlns:w16sdtdh="http://schemas.microsoft.com/office/word/2020/wordml/sdtdatahash" xmlns:w16sdtfl="http://schemas.microsoft.com/office/word/2024/wordml/sdtformatlock" xmlns:w16se="http://schemas.microsoft.com/office/word/2015/wordml/symex" xmlns:wpg="http://schemas.microsoft.com/office/word/2010/wordprocessingGroup" xmlns:wpi="http://schemas.microsoft.com/office/word/2010/wordprocessingInk" xmlns:wne="http://schemas.microsoft.com/office/word/2006/wordml" xmlns:wps="http://schemas.microsoft.com/office/word/2010/wordprocessingShape" mc:Ignorable="w14 w15 w16se w16cid w16 w16cex w16sdtdh w16sdtfl w16du wp14">
   <w16cid:commentId w16cid:paraId="678C87C1" w16cid:durableId="79E2A6E3"/>
   <w16cid:commentId w16cid:paraId="51CBD6D1" w16cid:durableId="6197010A"/>
+  <w16cid:commentId w16cid:paraId="03EE4563" w16cid:durableId="2C82FAB6"/>
   <w16cid:commentId w16cid:paraId="06C0E272" w16cid:durableId="777EB87E"/>
   <w16cid:commentId w16cid:paraId="4E3434D0" w16cid:durableId="208C7FE7"/>
-  <w16cid:commentId w16cid:paraId="5992D838" w16cid:durableId="37C95A50"/>
   <w16cid:commentId w16cid:paraId="3471AB53" w16cid:durableId="0E92A1BC"/>
   <w16cid:commentId w16cid:paraId="148A0BEE" w16cid:durableId="0444BDF2"/>
   <w16cid:commentId w16cid:paraId="55BD51FF" w16cid:durableId="1AE1AF2B"/>
   <w16cid:commentId w16cid:paraId="7EA423C7" w16cid:durableId="7BF59F8C"/>
-  <w16cid:commentId w16cid:paraId="2440C49E" w16cid:durableId="539ED425"/>
   <w16cid:commentId w16cid:paraId="00A06E06" w16cid:durableId="37956EA5"/>
   <w16cid:commentId w16cid:paraId="31E84DFE" w16cid:durableId="7B5EF19A"/>
-  <w16cid:commentId w16cid:paraId="39DF07D9" w16cid:durableId="6CD49BFE"/>
-  <w16cid:commentId w16cid:paraId="4C0DBE43" w16cid:durableId="69FA1417"/>
   <w16cid:commentId w16cid:paraId="7D7AD7A5" w16cid:durableId="7C4DD3A0"/>
-  <w16cid:commentId w16cid:paraId="7FC345B2" w16cid:durableId="174F3C13"/>
-  <w16cid:commentId w16cid:paraId="4D121C52" w16cid:durableId="6A3F06CB"/>
-  <w16cid:commentId w16cid:paraId="1CC502A4" w16cid:durableId="6B055EF6"/>
   <w16cid:commentId w16cid:paraId="2B055E78" w16cid:durableId="22307157"/>
   <w16cid:commentId w16cid:paraId="540E6716" w16cid:durableId="57669968"/>
 </w16cid:commentsIds>

</xml_diff>